<commit_message>
fix: resolve TOC ordering, remove duplicate title, and embed real figures in sample doc
</commit_message>
<xml_diff>
--- a/examples/sample_report.docx
+++ b/examples/sample_report.docx
@@ -2,21 +2,6 @@
 <file path=word/document.xml><?xml version="1.0" encoding="utf-8"?>
 <w:document xmlns:wpc="http://schemas.microsoft.com/office/word/2010/wordprocessingCanvas" xmlns:mo="http://schemas.microsoft.com/office/mac/office/2008/main" xmlns:mc="http://schemas.openxmlformats.org/markup-compatibility/2006" xmlns:mv="urn:schemas-microsoft-com:mac:vml" xmlns:o="urn:schemas-microsoft-com:office:office" xmlns:r="http://schemas.openxmlformats.org/officeDocument/2006/relationships" xmlns:m="http://schemas.openxmlformats.org/officeDocument/2006/math" xmlns:v="urn:schemas-microsoft-com:vml" xmlns:wp14="http://schemas.microsoft.com/office/word/2010/wordprocessingDrawing" xmlns:wp="http://schemas.openxmlformats.org/drawingml/2006/wordprocessingDrawing" xmlns:w10="urn:schemas-microsoft-com:office:word" xmlns:w="http://schemas.openxmlformats.org/wordprocessingml/2006/main" xmlns:w14="http://schemas.microsoft.com/office/word/2010/wordml" xmlns:wpg="http://schemas.microsoft.com/office/word/2010/wordprocessingGroup" xmlns:wpi="http://schemas.microsoft.com/office/word/2010/wordprocessingInk" xmlns:wne="http://schemas.microsoft.com/office/word/2006/wordml" xmlns:wps="http://schemas.microsoft.com/office/word/2010/wordprocessingShape" mc:Ignorable="w14 wp14">
   <w:body>
-    <w:p>
-      <w:pPr>
-        <w:keepNext/>
-        <w:spacing w:before="0" w:after="320"/>
-      </w:pPr>
-      <w:r>
-        <w:rPr>
-          <w:rFonts w:ascii="Arial" w:hAnsi="Arial"/>
-          <w:b/>
-          <w:color w:val="0F172A"/>
-          <w:sz w:val="48"/>
-        </w:rPr>
-        <w:t>High-Performance Microservice Mesh Architecture</w:t>
-      </w:r>
-    </w:p>
     <w:p>
       <w:pPr>
         <w:keepNext/>
@@ -62,6 +47,36 @@
       </w:r>
     </w:p>
     <w:p>
+      <w:pPr>
+        <w:spacing w:before="80" w:after="240" w:line="276" w:lineRule="auto"/>
+      </w:pPr>
+      <w:r>
+        <w:fldChar w:fldCharType="begin" w:dirty="true"/>
+      </w:r>
+      <w:r>
+        <w:rPr>
+          <w:rFonts w:ascii="Arial" w:hAnsi="Arial"/>
+          <w:sz w:val="20"/>
+        </w:rPr>
+        <w:instrText xml:space="preserve"> TOC \o "1-3" \h \z \u </w:instrText>
+      </w:r>
+      <w:r>
+        <w:fldChar w:fldCharType="separate"/>
+      </w:r>
+      <w:r>
+        <w:rPr>
+          <w:rFonts w:ascii="Arial" w:hAnsi="Arial"/>
+          <w:color w:val="64748B"/>
+          <w:i/>
+          <w:sz w:val="19"/>
+        </w:rPr>
+        <w:t xml:space="preserve">[Table of Contents: Automatically refreshed by Word on open. Right-click or press F9 to update]</w:t>
+      </w:r>
+      <w:r>
+        <w:fldChar w:fldCharType="end"/>
+      </w:r>
+    </w:p>
+    <w:p>
       <w:r>
         <w:br w:type="page"/>
       </w:r>
@@ -82,6 +97,36 @@
       </w:r>
     </w:p>
     <w:p>
+      <w:pPr>
+        <w:spacing w:before="80" w:after="240" w:line="276" w:lineRule="auto"/>
+      </w:pPr>
+      <w:r>
+        <w:fldChar w:fldCharType="begin" w:dirty="true"/>
+      </w:r>
+      <w:r>
+        <w:rPr>
+          <w:rFonts w:ascii="Arial" w:hAnsi="Arial"/>
+          <w:sz w:val="20"/>
+        </w:rPr>
+        <w:instrText xml:space="preserve"> TOC \c "Figure" \h \z </w:instrText>
+      </w:r>
+      <w:r>
+        <w:fldChar w:fldCharType="separate"/>
+      </w:r>
+      <w:r>
+        <w:rPr>
+          <w:rFonts w:ascii="Arial" w:hAnsi="Arial"/>
+          <w:color w:val="64748B"/>
+          <w:i/>
+          <w:sz w:val="19"/>
+        </w:rPr>
+        <w:t xml:space="preserve">[List of Figures: Automatically populated by Word. Right-click or press F9 to update]</w:t>
+      </w:r>
+      <w:r>
+        <w:fldChar w:fldCharType="end"/>
+      </w:r>
+    </w:p>
+    <w:p>
       <w:r>
         <w:br w:type="page"/>
       </w:r>
@@ -99,6 +144,36 @@
           <w:sz w:val="32"/>
         </w:rPr>
         <w:t>List of Tables</w:t>
+      </w:r>
+    </w:p>
+    <w:p>
+      <w:pPr>
+        <w:spacing w:before="80" w:after="240" w:line="276" w:lineRule="auto"/>
+      </w:pPr>
+      <w:r>
+        <w:fldChar w:fldCharType="begin" w:dirty="true"/>
+      </w:r>
+      <w:r>
+        <w:rPr>
+          <w:rFonts w:ascii="Arial" w:hAnsi="Arial"/>
+          <w:sz w:val="20"/>
+        </w:rPr>
+        <w:instrText xml:space="preserve"> TOC \c "Table" \h \z </w:instrText>
+      </w:r>
+      <w:r>
+        <w:fldChar w:fldCharType="separate"/>
+      </w:r>
+      <w:r>
+        <w:rPr>
+          <w:rFonts w:ascii="Arial" w:hAnsi="Arial"/>
+          <w:color w:val="64748B"/>
+          <w:i/>
+          <w:sz w:val="19"/>
+        </w:rPr>
+        <w:t xml:space="preserve">[List of Tables: Automatically populated by Word. Right-click or press F9 to update]</w:t>
+      </w:r>
+      <w:r>
+        <w:fldChar w:fldCharType="end"/>
       </w:r>
     </w:p>
     <w:p>
@@ -314,6 +389,22 @@
     </w:p>
     <w:p>
       <w:pPr>
+        <w:pStyle w:val="Heading2"/>
+        <w:keepNext/>
+        <w:outlineLvl w:val="1"/>
+      </w:pPr>
+      <w:r>
+        <w:rPr>
+          <w:rFonts w:ascii="Arial" w:hAnsi="Arial"/>
+          <w:b/>
+          <w:color w:val="1E293B"/>
+          <w:sz w:val="28"/>
+        </w:rPr>
+        <w:t>3.1 Service Queue Equilibrium</w:t>
+      </w:r>
+    </w:p>
+    <w:p>
+      <w:pPr>
         <w:keepNext/>
         <w:tabs>
           <w:tab w:pos="4680" w:val="center"/>
@@ -357,6 +448,22 @@
           <w:sz w:val="19"/>
         </w:rPr>
         <w:t>Little's Law relating queue length (L), request arrival rate (λ), and wait time (W).</w:t>
+      </w:r>
+    </w:p>
+    <w:p>
+      <w:pPr>
+        <w:pStyle w:val="Heading2"/>
+        <w:keepNext/>
+        <w:outlineLvl w:val="1"/>
+      </w:pPr>
+      <w:r>
+        <w:rPr>
+          <w:rFonts w:ascii="Arial" w:hAnsi="Arial"/>
+          <w:b/>
+          <w:color w:val="1E293B"/>
+          <w:sz w:val="28"/>
+        </w:rPr>
+        <w:t>3.2 Amdahl's Speedup Model</w:t>
       </w:r>
     </w:p>
     <w:p>
@@ -1079,6 +1186,41 @@
     </w:tbl>
     <w:p>
       <w:pPr>
+        <w:pStyle w:val="Caption"/>
+        <w:spacing w:before="80" w:after="240" w:line="276" w:lineRule="auto"/>
+        <w:jc w:val="center"/>
+      </w:pPr>
+      <w:r>
+        <w:rPr>
+          <w:rFonts w:ascii="Arial" w:hAnsi="Arial"/>
+          <w:b/>
+          <w:color w:val="64748B"/>
+          <w:sz w:val="19"/>
+        </w:rPr>
+        <w:t xml:space="preserve">Table </w:t>
+      </w:r>
+      <w:fldSimple w:instr="SEQ Table \* ARABIC">
+        <w:r>
+          <w:rPr>
+            <w:rFonts w:ascii="Arial" w:hAnsi="Arial"/>
+            <w:b/>
+            <w:sz w:val="19"/>
+            <w:color w:val="475569"/>
+          </w:rPr>
+          <w:t>1</w:t>
+        </w:r>
+      </w:fldSimple>
+      <w:r>
+        <w:rPr>
+          <w:rFonts w:ascii="Arial" w:hAnsi="Arial"/>
+          <w:color w:val="64748B"/>
+          <w:sz w:val="19"/>
+        </w:rPr>
+        <w:t>: Simulated High-Concurrency Throughput and Response Latency across Primary Pod Clusters.</w:t>
+      </w:r>
+    </w:p>
+    <w:p>
+      <w:pPr>
         <w:spacing w:before="0" w:after="120" w:line="276" w:lineRule="auto"/>
       </w:pPr>
       <w:r>
@@ -1087,7 +1229,7 @@
           <w:color w:val="1F2937"/>
           <w:sz w:val="21"/>
         </w:rPr>
-        <w:t>The following diagram illustrates network traffic segregation through the Envoy ingress layer.</w:t>
+        <w:t>The following diagram illustrates network traffic segregation and zero-trust mutual-TLS routing through the Envoy ingress layer.</w:t>
       </w:r>
     </w:p>
     <w:p>
@@ -1097,13 +1239,730 @@
         <w:jc w:val="center"/>
       </w:pPr>
       <w:r>
+        <w:drawing>
+          <wp:inline xmlns:a="http://schemas.openxmlformats.org/drawingml/2006/main" xmlns:pic="http://schemas.openxmlformats.org/drawingml/2006/picture">
+            <wp:extent cx="5303520" cy="2710688"/>
+            <wp:docPr id="1" name="Picture 1"/>
+            <wp:cNvGraphicFramePr>
+              <a:graphicFrameLocks noChangeAspect="1"/>
+            </wp:cNvGraphicFramePr>
+            <a:graphic>
+              <a:graphicData uri="http://schemas.openxmlformats.org/drawingml/2006/picture">
+                <pic:pic>
+                  <pic:nvPicPr>
+                    <pic:cNvPr id="0" name="architecture_topology.png"/>
+                    <pic:cNvPicPr/>
+                  </pic:nvPicPr>
+                  <pic:blipFill>
+                    <a:blip r:embed="rId11"/>
+                    <a:stretch>
+                      <a:fillRect/>
+                    </a:stretch>
+                  </pic:blipFill>
+                  <pic:spPr>
+                    <a:xfrm>
+                      <a:off x="0" y="0"/>
+                      <a:ext cx="5303520" cy="2710688"/>
+                    </a:xfrm>
+                    <a:prstGeom prst="rect"/>
+                  </pic:spPr>
+                </pic:pic>
+              </a:graphicData>
+            </a:graphic>
+          </wp:inline>
+        </w:drawing>
+      </w:r>
+    </w:p>
+    <w:p>
+      <w:pPr>
+        <w:pStyle w:val="Caption"/>
+        <w:spacing w:before="80" w:after="240" w:line="276" w:lineRule="auto"/>
+        <w:jc w:val="center"/>
+      </w:pPr>
+      <w:r>
         <w:rPr>
           <w:rFonts w:ascii="Arial" w:hAnsi="Arial"/>
-          <w:i/>
+          <w:b/>
           <w:color w:val="64748B"/>
-          <w:sz w:val="20"/>
+          <w:sz w:val="19"/>
         </w:rPr>
-        <w:t>[Diagram: Envoy Service Mesh Mutual-TLS Zero-Trust Routing Topology]</w:t>
+        <w:t xml:space="preserve">Figure </w:t>
+      </w:r>
+      <w:fldSimple w:instr="SEQ Figure \* ARABIC">
+        <w:r>
+          <w:rPr>
+            <w:rFonts w:ascii="Arial" w:hAnsi="Arial"/>
+            <w:b/>
+            <w:sz w:val="19"/>
+            <w:color w:val="475569"/>
+          </w:rPr>
+          <w:t>1</w:t>
+        </w:r>
+      </w:fldSimple>
+      <w:r>
+        <w:rPr>
+          <w:rFonts w:ascii="Arial" w:hAnsi="Arial"/>
+          <w:color w:val="64748B"/>
+          <w:sz w:val="19"/>
+        </w:rPr>
+        <w:t>: High-Availability Multi-Region Network Topology and Ingress Controller Layout.</w:t>
+      </w:r>
+    </w:p>
+    <w:p>
+      <w:pPr>
+        <w:spacing w:before="0" w:after="120" w:line="276" w:lineRule="auto"/>
+      </w:pPr>
+      <w:r>
+        <w:rPr>
+          <w:rFonts w:ascii="Arial" w:hAnsi="Arial"/>
+          <w:color w:val="1F2937"/>
+          <w:sz w:val="21"/>
+        </w:rPr>
+        <w:t>Autoscaling parameters and memory allocation ceilings were configured to ensure linear scaling characteristics under sustained burst traffic.</w:t>
+      </w:r>
+    </w:p>
+    <w:tbl>
+      <w:tblPr>
+        <w:tblW w:type="auto" w:w="0"/>
+        <w:jc w:val="center"/>
+        <w:tblLook w:firstColumn="1" w:firstRow="1" w:lastColumn="0" w:lastRow="0" w:noHBand="0" w:noVBand="1" w:val="04A0"/>
+        <w:tblBorders>
+          <w:top w:val="single" w:sz="4" w:space="0" w:color="E2E8F0"/>
+          <w:left w:val="none"/>
+          <w:bottom w:val="single" w:sz="6" w:space="0" w:color="E2E8F0"/>
+          <w:right w:val="none"/>
+          <w:insideH w:val="single" w:sz="4" w:space="0" w:color="E2E8F0"/>
+          <w:insideV w:val="none"/>
+        </w:tblBorders>
+      </w:tblPr>
+      <w:tblGrid>
+        <w:gridCol w:w="1872"/>
+        <w:gridCol w:w="1872"/>
+        <w:gridCol w:w="1872"/>
+        <w:gridCol w:w="1872"/>
+        <w:gridCol w:w="1872"/>
+      </w:tblGrid>
+      <w:tr>
+        <w:tc>
+          <w:tcPr>
+            <w:tcW w:type="dxa" w:w="1872"/>
+            <w:tcMar>
+              <w:top w:w="140" w:type="dxa"/>
+              <w:bottom w:w="140" w:type="dxa"/>
+              <w:left w:w="160" w:type="dxa"/>
+              <w:right w:w="160" w:type="dxa"/>
+            </w:tcMar>
+            <w:shd w:val="clear" w:color="auto" w:fill="F8FAFC"/>
+          </w:tcPr>
+          <w:p>
+            <w:pPr>
+              <w:spacing w:before="0" w:after="0" w:line="276" w:lineRule="auto"/>
+            </w:pPr>
+            <w:r>
+              <w:rPr>
+                <w:rFonts w:ascii="Arial" w:hAnsi="Arial"/>
+                <w:b/>
+                <w:color w:val="0F172A"/>
+                <w:sz w:val="19"/>
+              </w:rPr>
+              <w:t>Cluster Tier</w:t>
+            </w:r>
+          </w:p>
+        </w:tc>
+        <w:tc>
+          <w:tcPr>
+            <w:tcW w:type="dxa" w:w="1872"/>
+            <w:tcMar>
+              <w:top w:w="140" w:type="dxa"/>
+              <w:bottom w:w="140" w:type="dxa"/>
+              <w:left w:w="160" w:type="dxa"/>
+              <w:right w:w="160" w:type="dxa"/>
+            </w:tcMar>
+            <w:shd w:val="clear" w:color="auto" w:fill="F8FAFC"/>
+          </w:tcPr>
+          <w:p>
+            <w:pPr>
+              <w:spacing w:before="0" w:after="0" w:line="276" w:lineRule="auto"/>
+            </w:pPr>
+            <w:r>
+              <w:rPr>
+                <w:rFonts w:ascii="Arial" w:hAnsi="Arial"/>
+                <w:b/>
+                <w:color w:val="0F172A"/>
+                <w:sz w:val="19"/>
+              </w:rPr>
+              <w:t>Target CPU %</w:t>
+            </w:r>
+          </w:p>
+        </w:tc>
+        <w:tc>
+          <w:tcPr>
+            <w:tcW w:type="dxa" w:w="1872"/>
+            <w:tcMar>
+              <w:top w:w="140" w:type="dxa"/>
+              <w:bottom w:w="140" w:type="dxa"/>
+              <w:left w:w="160" w:type="dxa"/>
+              <w:right w:w="160" w:type="dxa"/>
+            </w:tcMar>
+            <w:shd w:val="clear" w:color="auto" w:fill="F8FAFC"/>
+          </w:tcPr>
+          <w:p>
+            <w:pPr>
+              <w:spacing w:before="0" w:after="0" w:line="276" w:lineRule="auto"/>
+            </w:pPr>
+            <w:r>
+              <w:rPr>
+                <w:rFonts w:ascii="Arial" w:hAnsi="Arial"/>
+                <w:b/>
+                <w:color w:val="0F172A"/>
+                <w:sz w:val="19"/>
+              </w:rPr>
+              <w:t>Min Pods</w:t>
+            </w:r>
+          </w:p>
+        </w:tc>
+        <w:tc>
+          <w:tcPr>
+            <w:tcW w:type="dxa" w:w="1872"/>
+            <w:tcMar>
+              <w:top w:w="140" w:type="dxa"/>
+              <w:bottom w:w="140" w:type="dxa"/>
+              <w:left w:w="160" w:type="dxa"/>
+              <w:right w:w="160" w:type="dxa"/>
+            </w:tcMar>
+            <w:shd w:val="clear" w:color="auto" w:fill="F8FAFC"/>
+          </w:tcPr>
+          <w:p>
+            <w:pPr>
+              <w:spacing w:before="0" w:after="0" w:line="276" w:lineRule="auto"/>
+            </w:pPr>
+            <w:r>
+              <w:rPr>
+                <w:rFonts w:ascii="Arial" w:hAnsi="Arial"/>
+                <w:b/>
+                <w:color w:val="0F172A"/>
+                <w:sz w:val="19"/>
+              </w:rPr>
+              <w:t>Max Pods</w:t>
+            </w:r>
+          </w:p>
+        </w:tc>
+        <w:tc>
+          <w:tcPr>
+            <w:tcW w:type="dxa" w:w="1872"/>
+            <w:tcMar>
+              <w:top w:w="140" w:type="dxa"/>
+              <w:bottom w:w="140" w:type="dxa"/>
+              <w:left w:w="160" w:type="dxa"/>
+              <w:right w:w="160" w:type="dxa"/>
+            </w:tcMar>
+            <w:shd w:val="clear" w:color="auto" w:fill="F8FAFC"/>
+          </w:tcPr>
+          <w:p>
+            <w:pPr>
+              <w:spacing w:before="0" w:after="0" w:line="276" w:lineRule="auto"/>
+            </w:pPr>
+            <w:r>
+              <w:rPr>
+                <w:rFonts w:ascii="Arial" w:hAnsi="Arial"/>
+                <w:b/>
+                <w:color w:val="0F172A"/>
+                <w:sz w:val="19"/>
+              </w:rPr>
+              <w:t>Scale-Up Window</w:t>
+            </w:r>
+          </w:p>
+        </w:tc>
+      </w:tr>
+      <w:tr>
+        <w:tc>
+          <w:tcPr>
+            <w:tcW w:type="dxa" w:w="1872"/>
+            <w:tcMar>
+              <w:top w:w="120" w:type="dxa"/>
+              <w:bottom w:w="120" w:type="dxa"/>
+              <w:left w:w="160" w:type="dxa"/>
+              <w:right w:w="160" w:type="dxa"/>
+            </w:tcMar>
+          </w:tcPr>
+          <w:p>
+            <w:pPr>
+              <w:spacing w:before="0" w:after="0" w:line="276" w:lineRule="auto"/>
+            </w:pPr>
+            <w:r>
+              <w:rPr>
+                <w:rFonts w:ascii="Arial" w:hAnsi="Arial"/>
+                <w:color w:val="1F2937"/>
+                <w:sz w:val="19"/>
+              </w:rPr>
+              <w:t>Edge Ingress</w:t>
+            </w:r>
+          </w:p>
+        </w:tc>
+        <w:tc>
+          <w:tcPr>
+            <w:tcW w:type="dxa" w:w="1872"/>
+            <w:tcMar>
+              <w:top w:w="120" w:type="dxa"/>
+              <w:bottom w:w="120" w:type="dxa"/>
+              <w:left w:w="160" w:type="dxa"/>
+              <w:right w:w="160" w:type="dxa"/>
+            </w:tcMar>
+          </w:tcPr>
+          <w:p>
+            <w:pPr>
+              <w:spacing w:before="0" w:after="0" w:line="276" w:lineRule="auto"/>
+            </w:pPr>
+            <w:r>
+              <w:rPr>
+                <w:rFonts w:ascii="Arial" w:hAnsi="Arial"/>
+                <w:color w:val="1F2937"/>
+                <w:sz w:val="19"/>
+              </w:rPr>
+              <w:t>65%</w:t>
+            </w:r>
+          </w:p>
+        </w:tc>
+        <w:tc>
+          <w:tcPr>
+            <w:tcW w:type="dxa" w:w="1872"/>
+            <w:tcMar>
+              <w:top w:w="120" w:type="dxa"/>
+              <w:bottom w:w="120" w:type="dxa"/>
+              <w:left w:w="160" w:type="dxa"/>
+              <w:right w:w="160" w:type="dxa"/>
+            </w:tcMar>
+          </w:tcPr>
+          <w:p>
+            <w:pPr>
+              <w:spacing w:before="0" w:after="0" w:line="276" w:lineRule="auto"/>
+            </w:pPr>
+            <w:r>
+              <w:rPr>
+                <w:rFonts w:ascii="Arial" w:hAnsi="Arial"/>
+                <w:color w:val="1F2937"/>
+                <w:sz w:val="19"/>
+              </w:rPr>
+              <w:t>8</w:t>
+            </w:r>
+          </w:p>
+        </w:tc>
+        <w:tc>
+          <w:tcPr>
+            <w:tcW w:type="dxa" w:w="1872"/>
+            <w:tcMar>
+              <w:top w:w="120" w:type="dxa"/>
+              <w:bottom w:w="120" w:type="dxa"/>
+              <w:left w:w="160" w:type="dxa"/>
+              <w:right w:w="160" w:type="dxa"/>
+            </w:tcMar>
+          </w:tcPr>
+          <w:p>
+            <w:pPr>
+              <w:spacing w:before="0" w:after="0" w:line="276" w:lineRule="auto"/>
+            </w:pPr>
+            <w:r>
+              <w:rPr>
+                <w:rFonts w:ascii="Arial" w:hAnsi="Arial"/>
+                <w:color w:val="1F2937"/>
+                <w:sz w:val="19"/>
+              </w:rPr>
+              <w:t>48</w:t>
+            </w:r>
+          </w:p>
+        </w:tc>
+        <w:tc>
+          <w:tcPr>
+            <w:tcW w:type="dxa" w:w="1872"/>
+            <w:tcMar>
+              <w:top w:w="120" w:type="dxa"/>
+              <w:bottom w:w="120" w:type="dxa"/>
+              <w:left w:w="160" w:type="dxa"/>
+              <w:right w:w="160" w:type="dxa"/>
+            </w:tcMar>
+          </w:tcPr>
+          <w:p>
+            <w:pPr>
+              <w:spacing w:before="0" w:after="0" w:line="276" w:lineRule="auto"/>
+            </w:pPr>
+            <w:r>
+              <w:rPr>
+                <w:rFonts w:ascii="Arial" w:hAnsi="Arial"/>
+                <w:color w:val="1F2937"/>
+                <w:sz w:val="19"/>
+              </w:rPr>
+              <w:t>15 seconds</w:t>
+            </w:r>
+          </w:p>
+        </w:tc>
+      </w:tr>
+      <w:tr>
+        <w:tc>
+          <w:tcPr>
+            <w:tcW w:type="dxa" w:w="1872"/>
+            <w:tcMar>
+              <w:top w:w="120" w:type="dxa"/>
+              <w:bottom w:w="120" w:type="dxa"/>
+              <w:left w:w="160" w:type="dxa"/>
+              <w:right w:w="160" w:type="dxa"/>
+            </w:tcMar>
+          </w:tcPr>
+          <w:p>
+            <w:pPr>
+              <w:spacing w:before="0" w:after="0" w:line="276" w:lineRule="auto"/>
+            </w:pPr>
+            <w:r>
+              <w:rPr>
+                <w:rFonts w:ascii="Arial" w:hAnsi="Arial"/>
+                <w:color w:val="1F2937"/>
+                <w:sz w:val="19"/>
+              </w:rPr>
+              <w:t>Authentication Core</w:t>
+            </w:r>
+          </w:p>
+        </w:tc>
+        <w:tc>
+          <w:tcPr>
+            <w:tcW w:type="dxa" w:w="1872"/>
+            <w:tcMar>
+              <w:top w:w="120" w:type="dxa"/>
+              <w:bottom w:w="120" w:type="dxa"/>
+              <w:left w:w="160" w:type="dxa"/>
+              <w:right w:w="160" w:type="dxa"/>
+            </w:tcMar>
+          </w:tcPr>
+          <w:p>
+            <w:pPr>
+              <w:spacing w:before="0" w:after="0" w:line="276" w:lineRule="auto"/>
+            </w:pPr>
+            <w:r>
+              <w:rPr>
+                <w:rFonts w:ascii="Arial" w:hAnsi="Arial"/>
+                <w:color w:val="1F2937"/>
+                <w:sz w:val="19"/>
+              </w:rPr>
+              <w:t>70%</w:t>
+            </w:r>
+          </w:p>
+        </w:tc>
+        <w:tc>
+          <w:tcPr>
+            <w:tcW w:type="dxa" w:w="1872"/>
+            <w:tcMar>
+              <w:top w:w="120" w:type="dxa"/>
+              <w:bottom w:w="120" w:type="dxa"/>
+              <w:left w:w="160" w:type="dxa"/>
+              <w:right w:w="160" w:type="dxa"/>
+            </w:tcMar>
+          </w:tcPr>
+          <w:p>
+            <w:pPr>
+              <w:spacing w:before="0" w:after="0" w:line="276" w:lineRule="auto"/>
+            </w:pPr>
+            <w:r>
+              <w:rPr>
+                <w:rFonts w:ascii="Arial" w:hAnsi="Arial"/>
+                <w:color w:val="1F2937"/>
+                <w:sz w:val="19"/>
+              </w:rPr>
+              <w:t>4</w:t>
+            </w:r>
+          </w:p>
+        </w:tc>
+        <w:tc>
+          <w:tcPr>
+            <w:tcW w:type="dxa" w:w="1872"/>
+            <w:tcMar>
+              <w:top w:w="120" w:type="dxa"/>
+              <w:bottom w:w="120" w:type="dxa"/>
+              <w:left w:w="160" w:type="dxa"/>
+              <w:right w:w="160" w:type="dxa"/>
+            </w:tcMar>
+          </w:tcPr>
+          <w:p>
+            <w:pPr>
+              <w:spacing w:before="0" w:after="0" w:line="276" w:lineRule="auto"/>
+            </w:pPr>
+            <w:r>
+              <w:rPr>
+                <w:rFonts w:ascii="Arial" w:hAnsi="Arial"/>
+                <w:color w:val="1F2937"/>
+                <w:sz w:val="19"/>
+              </w:rPr>
+              <w:t>32</w:t>
+            </w:r>
+          </w:p>
+        </w:tc>
+        <w:tc>
+          <w:tcPr>
+            <w:tcW w:type="dxa" w:w="1872"/>
+            <w:tcMar>
+              <w:top w:w="120" w:type="dxa"/>
+              <w:bottom w:w="120" w:type="dxa"/>
+              <w:left w:w="160" w:type="dxa"/>
+              <w:right w:w="160" w:type="dxa"/>
+            </w:tcMar>
+          </w:tcPr>
+          <w:p>
+            <w:pPr>
+              <w:spacing w:before="0" w:after="0" w:line="276" w:lineRule="auto"/>
+            </w:pPr>
+            <w:r>
+              <w:rPr>
+                <w:rFonts w:ascii="Arial" w:hAnsi="Arial"/>
+                <w:color w:val="1F2937"/>
+                <w:sz w:val="19"/>
+              </w:rPr>
+              <w:t>20 seconds</w:t>
+            </w:r>
+          </w:p>
+        </w:tc>
+      </w:tr>
+      <w:tr>
+        <w:tc>
+          <w:tcPr>
+            <w:tcW w:type="dxa" w:w="1872"/>
+            <w:tcMar>
+              <w:top w:w="120" w:type="dxa"/>
+              <w:bottom w:w="120" w:type="dxa"/>
+              <w:left w:w="160" w:type="dxa"/>
+              <w:right w:w="160" w:type="dxa"/>
+            </w:tcMar>
+          </w:tcPr>
+          <w:p>
+            <w:pPr>
+              <w:spacing w:before="0" w:after="0" w:line="276" w:lineRule="auto"/>
+            </w:pPr>
+            <w:r>
+              <w:rPr>
+                <w:rFonts w:ascii="Arial" w:hAnsi="Arial"/>
+                <w:color w:val="1F2937"/>
+                <w:sz w:val="19"/>
+              </w:rPr>
+              <w:t>Transactional DB</w:t>
+            </w:r>
+          </w:p>
+        </w:tc>
+        <w:tc>
+          <w:tcPr>
+            <w:tcW w:type="dxa" w:w="1872"/>
+            <w:tcMar>
+              <w:top w:w="120" w:type="dxa"/>
+              <w:bottom w:w="120" w:type="dxa"/>
+              <w:left w:w="160" w:type="dxa"/>
+              <w:right w:w="160" w:type="dxa"/>
+            </w:tcMar>
+          </w:tcPr>
+          <w:p>
+            <w:pPr>
+              <w:spacing w:before="0" w:after="0" w:line="276" w:lineRule="auto"/>
+            </w:pPr>
+            <w:r>
+              <w:rPr>
+                <w:rFonts w:ascii="Arial" w:hAnsi="Arial"/>
+                <w:color w:val="1F2937"/>
+                <w:sz w:val="19"/>
+              </w:rPr>
+              <w:t>55%</w:t>
+            </w:r>
+          </w:p>
+        </w:tc>
+        <w:tc>
+          <w:tcPr>
+            <w:tcW w:type="dxa" w:w="1872"/>
+            <w:tcMar>
+              <w:top w:w="120" w:type="dxa"/>
+              <w:bottom w:w="120" w:type="dxa"/>
+              <w:left w:w="160" w:type="dxa"/>
+              <w:right w:w="160" w:type="dxa"/>
+            </w:tcMar>
+          </w:tcPr>
+          <w:p>
+            <w:pPr>
+              <w:spacing w:before="0" w:after="0" w:line="276" w:lineRule="auto"/>
+            </w:pPr>
+            <w:r>
+              <w:rPr>
+                <w:rFonts w:ascii="Arial" w:hAnsi="Arial"/>
+                <w:color w:val="1F2937"/>
+                <w:sz w:val="19"/>
+              </w:rPr>
+              <w:t>3</w:t>
+            </w:r>
+          </w:p>
+        </w:tc>
+        <w:tc>
+          <w:tcPr>
+            <w:tcW w:type="dxa" w:w="1872"/>
+            <w:tcMar>
+              <w:top w:w="120" w:type="dxa"/>
+              <w:bottom w:w="120" w:type="dxa"/>
+              <w:left w:w="160" w:type="dxa"/>
+              <w:right w:w="160" w:type="dxa"/>
+            </w:tcMar>
+          </w:tcPr>
+          <w:p>
+            <w:pPr>
+              <w:spacing w:before="0" w:after="0" w:line="276" w:lineRule="auto"/>
+            </w:pPr>
+            <w:r>
+              <w:rPr>
+                <w:rFonts w:ascii="Arial" w:hAnsi="Arial"/>
+                <w:color w:val="1F2937"/>
+                <w:sz w:val="19"/>
+              </w:rPr>
+              <w:t>12</w:t>
+            </w:r>
+          </w:p>
+        </w:tc>
+        <w:tc>
+          <w:tcPr>
+            <w:tcW w:type="dxa" w:w="1872"/>
+            <w:tcMar>
+              <w:top w:w="120" w:type="dxa"/>
+              <w:bottom w:w="120" w:type="dxa"/>
+              <w:left w:w="160" w:type="dxa"/>
+              <w:right w:w="160" w:type="dxa"/>
+            </w:tcMar>
+          </w:tcPr>
+          <w:p>
+            <w:pPr>
+              <w:spacing w:before="0" w:after="0" w:line="276" w:lineRule="auto"/>
+            </w:pPr>
+            <w:r>
+              <w:rPr>
+                <w:rFonts w:ascii="Arial" w:hAnsi="Arial"/>
+                <w:color w:val="1F2937"/>
+                <w:sz w:val="19"/>
+              </w:rPr>
+              <w:t>45 seconds</w:t>
+            </w:r>
+          </w:p>
+        </w:tc>
+      </w:tr>
+    </w:tbl>
+    <w:p>
+      <w:pPr>
+        <w:pStyle w:val="Caption"/>
+        <w:spacing w:before="80" w:after="240" w:line="276" w:lineRule="auto"/>
+        <w:jc w:val="center"/>
+      </w:pPr>
+      <w:r>
+        <w:rPr>
+          <w:rFonts w:ascii="Arial" w:hAnsi="Arial"/>
+          <w:b/>
+          <w:color w:val="64748B"/>
+          <w:sz w:val="19"/>
+        </w:rPr>
+        <w:t xml:space="preserve">Table </w:t>
+      </w:r>
+      <w:fldSimple w:instr="SEQ Table \* ARABIC">
+        <w:r>
+          <w:rPr>
+            <w:rFonts w:ascii="Arial" w:hAnsi="Arial"/>
+            <w:b/>
+            <w:sz w:val="19"/>
+            <w:color w:val="475569"/>
+          </w:rPr>
+          <w:t>1</w:t>
+        </w:r>
+      </w:fldSimple>
+      <w:r>
+        <w:rPr>
+          <w:rFonts w:ascii="Arial" w:hAnsi="Arial"/>
+          <w:color w:val="64748B"/>
+          <w:sz w:val="19"/>
+        </w:rPr>
+        <w:t>: Horizontal Pod Autoscaler (HPA) Policy Configuration.</w:t>
+      </w:r>
+    </w:p>
+    <w:p>
+      <w:pPr>
+        <w:spacing w:before="0" w:after="120" w:line="276" w:lineRule="auto"/>
+      </w:pPr>
+      <w:r>
+        <w:rPr>
+          <w:rFonts w:ascii="Arial" w:hAnsi="Arial"/>
+          <w:color w:val="1F2937"/>
+          <w:sz w:val="21"/>
+        </w:rPr>
+        <w:t>Empirical latency profiles measured across each service pod are displayed in the benchmark chart below.</w:t>
+      </w:r>
+    </w:p>
+    <w:p>
+      <w:pPr>
+        <w:keepNext/>
+        <w:spacing w:before="160" w:after="80"/>
+        <w:jc w:val="center"/>
+      </w:pPr>
+      <w:r>
+        <w:drawing>
+          <wp:inline xmlns:a="http://schemas.openxmlformats.org/drawingml/2006/main" xmlns:pic="http://schemas.openxmlformats.org/drawingml/2006/picture">
+            <wp:extent cx="5303520" cy="2474976"/>
+            <wp:docPr id="2" name="Picture 2"/>
+            <wp:cNvGraphicFramePr>
+              <a:graphicFrameLocks noChangeAspect="1"/>
+            </wp:cNvGraphicFramePr>
+            <a:graphic>
+              <a:graphicData uri="http://schemas.openxmlformats.org/drawingml/2006/picture">
+                <pic:pic>
+                  <pic:nvPicPr>
+                    <pic:cNvPr id="0" name="benchmark_chart.png"/>
+                    <pic:cNvPicPr/>
+                  </pic:nvPicPr>
+                  <pic:blipFill>
+                    <a:blip r:embed="rId12"/>
+                    <a:stretch>
+                      <a:fillRect/>
+                    </a:stretch>
+                  </pic:blipFill>
+                  <pic:spPr>
+                    <a:xfrm>
+                      <a:off x="0" y="0"/>
+                      <a:ext cx="5303520" cy="2474976"/>
+                    </a:xfrm>
+                    <a:prstGeom prst="rect"/>
+                  </pic:spPr>
+                </pic:pic>
+              </a:graphicData>
+            </a:graphic>
+          </wp:inline>
+        </w:drawing>
+      </w:r>
+    </w:p>
+    <w:p>
+      <w:pPr>
+        <w:pStyle w:val="Caption"/>
+        <w:spacing w:before="80" w:after="240" w:line="276" w:lineRule="auto"/>
+        <w:jc w:val="center"/>
+      </w:pPr>
+      <w:r>
+        <w:rPr>
+          <w:rFonts w:ascii="Arial" w:hAnsi="Arial"/>
+          <w:b/>
+          <w:color w:val="64748B"/>
+          <w:sz w:val="19"/>
+        </w:rPr>
+        <w:t xml:space="preserve">Figure </w:t>
+      </w:r>
+      <w:fldSimple w:instr="SEQ Figure \* ARABIC">
+        <w:r>
+          <w:rPr>
+            <w:rFonts w:ascii="Arial" w:hAnsi="Arial"/>
+            <w:b/>
+            <w:sz w:val="19"/>
+            <w:color w:val="475569"/>
+          </w:rPr>
+          <w:t>1</w:t>
+        </w:r>
+      </w:fldSimple>
+      <w:r>
+        <w:rPr>
+          <w:rFonts w:ascii="Arial" w:hAnsi="Arial"/>
+          <w:color w:val="64748B"/>
+          <w:sz w:val="19"/>
+        </w:rPr>
+        <w:t>: Service Mesh Latency vs. Throughput Scaling Benchmarks Across Cluster Nodes.</w:t>
       </w:r>
     </w:p>
     <w:p>
@@ -1142,169 +2001,6 @@
       <w:cols w:space="720"/>
       <w:docGrid w:linePitch="360"/>
     </w:sectPr>
-    <w:p>
-      <w:pPr>
-        <w:spacing w:before="0" w:after="120" w:line="276" w:lineRule="auto"/>
-      </w:pPr>
-      <w:r>
-        <w:fldChar w:fldCharType="begin"/>
-      </w:r>
-      <w:r>
-        <w:rPr>
-          <w:rFonts w:ascii="Arial" w:hAnsi="Arial"/>
-          <w:color w:val="64748B"/>
-          <w:sz w:val="20"/>
-        </w:rPr>
-        <w:instrText xml:space="preserve"> TOC \o "1-3" \h \z \u </w:instrText>
-      </w:r>
-      <w:r>
-        <w:fldChar w:fldCharType="separate"/>
-      </w:r>
-      <w:r>
-        <w:rPr>
-          <w:rFonts w:ascii="Arial" w:hAnsi="Arial"/>
-          <w:color w:val="64748B"/>
-          <w:i/>
-          <w:sz w:val="19"/>
-        </w:rPr>
-        <w:t xml:space="preserve">[Table of Contents: Automatically refreshed by Word on open. Press F9 to update anytime]</w:t>
-      </w:r>
-      <w:r>
-        <w:fldChar w:fldCharType="end"/>
-      </w:r>
-    </w:p>
-    <w:p>
-      <w:pPr>
-        <w:spacing w:before="0" w:after="120" w:line="276" w:lineRule="auto"/>
-      </w:pPr>
-      <w:r>
-        <w:fldChar w:fldCharType="begin"/>
-      </w:r>
-      <w:r>
-        <w:rPr>
-          <w:rFonts w:ascii="Arial" w:hAnsi="Arial"/>
-          <w:color w:val="64748B"/>
-          <w:sz w:val="20"/>
-        </w:rPr>
-        <w:instrText xml:space="preserve"> TOC \c "Figure" \h \z </w:instrText>
-      </w:r>
-      <w:r>
-        <w:fldChar w:fldCharType="separate"/>
-      </w:r>
-      <w:r>
-        <w:rPr>
-          <w:rFonts w:ascii="Arial" w:hAnsi="Arial"/>
-          <w:color w:val="64748B"/>
-          <w:i/>
-          <w:sz w:val="19"/>
-        </w:rPr>
-        <w:t xml:space="preserve">[List of Figures: Automatically populated by Word. Press F9 to update]</w:t>
-      </w:r>
-      <w:r>
-        <w:fldChar w:fldCharType="end"/>
-      </w:r>
-    </w:p>
-    <w:p>
-      <w:pPr>
-        <w:spacing w:before="0" w:after="120" w:line="276" w:lineRule="auto"/>
-      </w:pPr>
-      <w:r>
-        <w:fldChar w:fldCharType="begin"/>
-      </w:r>
-      <w:r>
-        <w:rPr>
-          <w:rFonts w:ascii="Arial" w:hAnsi="Arial"/>
-          <w:color w:val="64748B"/>
-          <w:sz w:val="20"/>
-        </w:rPr>
-        <w:instrText xml:space="preserve"> TOC \c "Table" \h \z </w:instrText>
-      </w:r>
-      <w:r>
-        <w:fldChar w:fldCharType="separate"/>
-      </w:r>
-      <w:r>
-        <w:rPr>
-          <w:rFonts w:ascii="Arial" w:hAnsi="Arial"/>
-          <w:color w:val="64748B"/>
-          <w:i/>
-          <w:sz w:val="19"/>
-        </w:rPr>
-        <w:t xml:space="preserve">[List of Tables: Automatically populated by Word. Press F9 to update]</w:t>
-      </w:r>
-      <w:r>
-        <w:fldChar w:fldCharType="end"/>
-      </w:r>
-    </w:p>
-    <w:p>
-      <w:pPr>
-        <w:pStyle w:val="Caption"/>
-        <w:jc w:val="center"/>
-        <w:spacing w:before="80" w:after="200" w:line="240" w:lineRule="auto"/>
-      </w:pPr>
-      <w:r>
-        <w:rPr>
-          <w:rFonts w:ascii="Arial" w:hAnsi="Arial"/>
-          <w:b/>
-          <w:sz w:val="19"/>
-          <w:color w:val="475569"/>
-        </w:rPr>
-        <w:t xml:space="preserve">Table </w:t>
-      </w:r>
-      <w:fldSimple w:instr="SEQ Table \* ARABIC">
-        <w:r>
-          <w:rPr>
-            <w:rFonts w:ascii="Arial" w:hAnsi="Arial"/>
-            <w:b/>
-            <w:sz w:val="19"/>
-            <w:color w:val="475569"/>
-          </w:rPr>
-          <w:t>1</w:t>
-        </w:r>
-      </w:fldSimple>
-      <w:r>
-        <w:rPr>
-          <w:rFonts w:ascii="Arial" w:hAnsi="Arial"/>
-          <w:sz w:val="19"/>
-          <w:color w:val="475569"/>
-        </w:rPr>
-        <w:t xml:space="preserve">: Simulated High-Concurrency Throughput and Response Latency across Primary Pod Clusters.</w:t>
-      </w:r>
-    </w:p>
-    <w:p>
-      <w:pPr>
-        <w:pStyle w:val="Caption"/>
-        <w:jc w:val="center"/>
-        <w:spacing w:before="80" w:after="200" w:line="240" w:lineRule="auto"/>
-      </w:pPr>
-      <w:r>
-        <w:rPr>
-          <w:rFonts w:ascii="Arial" w:hAnsi="Arial"/>
-          <w:b/>
-          <w:sz w:val="19"/>
-          <w:color w:val="475569"/>
-        </w:rPr>
-        <w:t xml:space="preserve">Figure </w:t>
-      </w:r>
-      <w:fldSimple w:instr="SEQ Figure \* ARABIC">
-        <w:r>
-          <w:rPr>
-            <w:rFonts w:ascii="Arial" w:hAnsi="Arial"/>
-            <w:b/>
-            <w:sz w:val="19"/>
-            <w:color w:val="475569"/>
-          </w:rPr>
-          <w:t>1</w:t>
-        </w:r>
-      </w:fldSimple>
-      <w:r>
-        <w:rPr>
-          <w:rFonts w:ascii="Arial" w:hAnsi="Arial"/>
-          <w:sz w:val="19"/>
-          <w:color w:val="475569"/>
-        </w:rPr>
-        <w:t xml:space="preserve">: High-Availability Mutual-TLS Zero-Trust Cluster Boundary Layout.</w:t>
-      </w:r>
-    </w:p>
   </w:body>
 </w:document>
 </file>

</xml_diff>